<commit_message>
Voeg template voor voortgang voorfase producten toe.
Closes #760.
</commit_message>
<xml_diff>
--- a/docs/wip/ICTU-Template-Compacte-Voorfase.docx
+++ b/docs/wip/ICTU-Template-Compacte-Voorfase.docx
@@ -191,7 +191,7 @@
         <w:rPr>
           <w:highlight w:val="yellow"/>
         </w:rPr>
-        <w:t>{Verwijder eventueel deze paragraaf en de rubricering op de titelpagina indien rubricering niet van toepassing is}</w:t>
+        <w:t>{Verwijder deze paragraaf en de rubricering op de titelpagina als rubricering niet van toepassing is}</w:t>
       </w:r>
     </w:p>
     <w:tbl>
@@ -302,793 +302,7 @@
         <w:pStyle w:val="Kop6"/>
       </w:pPr>
       <w:r>
-        <w:t>Revisiehistorie</w:t>
-      </w:r>
-    </w:p>
-    <w:tbl>
-      <w:tblPr>
-        <w:tblStyle w:val="Tabelraster1"/>
-        <w:tblW w:type="pct" w:w="100%"/>
-        <w:tblLook w:firstColumn="1" w:firstRow="1" w:lastColumn="0" w:lastRow="0" w:noHBand="0" w:noVBand="1" w:val="04A0"/>
-      </w:tblPr>
-      <w:tblGrid>
-        <w:gridCol w:w="1814"/>
-        <w:gridCol w:w="1814"/>
-        <w:gridCol w:w="1814"/>
-        <w:gridCol w:w="1814"/>
-        <w:gridCol w:w="1814"/>
-      </w:tblGrid>
-      <w:tr>
-        <w:tc>
-          <w:tcPr>
-            <w:tcW w:type="auto" w:w="1814"/>
-          </w:tcPr>
-          <w:p>
-            <w:pPr>
-              <w:jc w:val="left"/>
-            </w:pPr>
-            <w:r>
-              <w:t>Versie</w:t>
-            </w:r>
-          </w:p>
-        </w:tc>
-        <w:tc>
-          <w:tcPr>
-            <w:tcW w:type="auto" w:w="1814"/>
-          </w:tcPr>
-          <w:p>
-            <w:pPr>
-              <w:jc w:val="left"/>
-            </w:pPr>
-            <w:r>
-              <w:t>Auteur</w:t>
-            </w:r>
-          </w:p>
-        </w:tc>
-        <w:tc>
-          <w:tcPr>
-            <w:tcW w:type="auto" w:w="1814"/>
-          </w:tcPr>
-          <w:p>
-            <w:pPr>
-              <w:jc w:val="left"/>
-            </w:pPr>
-            <w:r>
-              <w:t>Datum</w:t>
-            </w:r>
-          </w:p>
-        </w:tc>
-        <w:tc>
-          <w:tcPr>
-            <w:tcW w:type="auto" w:w="1814"/>
-          </w:tcPr>
-          <w:p>
-            <w:pPr>
-              <w:jc w:val="left"/>
-            </w:pPr>
-            <w:r>
-              <w:t>Status</w:t>
-            </w:r>
-          </w:p>
-        </w:tc>
-        <w:tc>
-          <w:tcPr>
-            <w:tcW w:type="auto" w:w="1814"/>
-          </w:tcPr>
-          <w:p>
-            <w:pPr>
-              <w:jc w:val="left"/>
-            </w:pPr>
-            <w:r>
-              <w:t>Opmerkingen</w:t>
-            </w:r>
-          </w:p>
-        </w:tc>
-      </w:tr>
-      <w:tr>
-        <w:tc>
-          <w:tcPr>
-            <w:tcW w:type="auto" w:w="1814"/>
-          </w:tcPr>
-          <w:p>
-            <w:pPr>
-              <w:jc w:val="left"/>
-            </w:pPr>
-            <w:r>
-              <w:rPr>
-                <w:highlight w:val="yellow"/>
-              </w:rPr>
-              <w:t>{versie}</w:t>
-            </w:r>
-          </w:p>
-        </w:tc>
-        <w:tc>
-          <w:tcPr>
-            <w:tcW w:type="auto" w:w="1814"/>
-          </w:tcPr>
-          <w:p>
-            <w:pPr>
-              <w:jc w:val="left"/>
-            </w:pPr>
-            <w:r>
-              <w:rPr>
-                <w:highlight w:val="yellow"/>
-              </w:rPr>
-              <w:t>{naam auteur}</w:t>
-            </w:r>
-          </w:p>
-        </w:tc>
-        <w:tc>
-          <w:tcPr>
-            <w:tcW w:type="auto" w:w="1814"/>
-          </w:tcPr>
-          <w:p>
-            <w:pPr>
-              <w:jc w:val="left"/>
-            </w:pPr>
-            <w:r>
-              <w:rPr>
-                <w:highlight w:val="yellow"/>
-              </w:rPr>
-              <w:t>{datum}</w:t>
-            </w:r>
-          </w:p>
-        </w:tc>
-        <w:tc>
-          <w:tcPr>
-            <w:tcW w:type="auto" w:w="1814"/>
-          </w:tcPr>
-          <w:p>
-            <w:pPr>
-              <w:jc w:val="left"/>
-            </w:pPr>
-            <w:r>
-              <w:rPr>
-                <w:highlight w:val="yellow"/>
-              </w:rPr>
-              <w:t>{concept/definitief}</w:t>
-            </w:r>
-          </w:p>
-        </w:tc>
-        <w:tc>
-          <w:tcPr>
-            <w:tcW w:type="auto" w:w="1814"/>
-          </w:tcPr>
-          <w:p>
-            <w:pPr>
-              <w:jc w:val="left"/>
-            </w:pPr>
-            <w:r>
-              <w:rPr>
-                <w:highlight w:val="yellow"/>
-              </w:rPr>
-              <w:t>{opmerkingen}</w:t>
-            </w:r>
-          </w:p>
-        </w:tc>
-      </w:tr>
-    </w:tbl>
-    <w:p>
-      <w:pPr>
-        <w:pStyle w:val="Kop6"/>
-      </w:pPr>
-      <w:r>
-        <w:t>Reviewers</w:t>
-      </w:r>
-    </w:p>
-    <w:tbl>
-      <w:tblPr>
-        <w:tblStyle w:val="Tabelraster1"/>
-        <w:tblW w:type="pct" w:w="100%"/>
-        <w:tblLook w:firstColumn="1" w:firstRow="1" w:lastColumn="0" w:lastRow="0" w:noHBand="0" w:noVBand="1" w:val="04A0"/>
-      </w:tblPr>
-      <w:tblGrid>
-        <w:gridCol w:w="2267"/>
-        <w:gridCol w:w="2267"/>
-        <w:gridCol w:w="2267"/>
-        <w:gridCol w:w="2267"/>
-      </w:tblGrid>
-      <w:tr>
-        <w:tc>
-          <w:tcPr>
-            <w:tcW w:type="auto" w:w="2267"/>
-          </w:tcPr>
-          <w:p>
-            <w:pPr>
-              <w:jc w:val="left"/>
-            </w:pPr>
-            <w:r>
-              <w:t>Functie/rol</w:t>
-            </w:r>
-          </w:p>
-        </w:tc>
-        <w:tc>
-          <w:tcPr>
-            <w:tcW w:type="auto" w:w="2267"/>
-          </w:tcPr>
-          <w:p>
-            <w:pPr>
-              <w:jc w:val="left"/>
-            </w:pPr>
-            <w:r>
-              <w:t>Naam</w:t>
-            </w:r>
-          </w:p>
-        </w:tc>
-        <w:tc>
-          <w:tcPr>
-            <w:tcW w:type="auto" w:w="2267"/>
-          </w:tcPr>
-          <w:p>
-            <w:pPr>
-              <w:jc w:val="left"/>
-            </w:pPr>
-            <w:r>
-              <w:t>Datum</w:t>
-            </w:r>
-          </w:p>
-        </w:tc>
-        <w:tc>
-          <w:tcPr>
-            <w:tcW w:type="auto" w:w="2267"/>
-          </w:tcPr>
-          <w:p>
-            <w:pPr>
-              <w:jc w:val="center"/>
-            </w:pPr>
-            <w:r>
-              <w:t>Versie</w:t>
-            </w:r>
-          </w:p>
-        </w:tc>
-      </w:tr>
-      <w:tr>
-        <w:tc>
-          <w:tcPr>
-            <w:tcW w:type="auto" w:w="2267"/>
-          </w:tcPr>
-          <w:p>
-            <w:pPr>
-              <w:jc w:val="left"/>
-            </w:pPr>
-            <w:r>
-              <w:t xml:space="preserve">Kwaliteitsmanager </w:t>
-            </w:r>
-            <w:r>
-              <w:rPr>
-                <w:highlight w:val="yellow"/>
-              </w:rPr>
-              <w:t>{opdrachtgevende organisatie}</w:t>
-            </w:r>
-          </w:p>
-        </w:tc>
-        <w:tc>
-          <w:tcPr>
-            <w:tcW w:type="auto" w:w="2267"/>
-          </w:tcPr>
-          <w:p>
-            <w:pPr>
-              <w:jc w:val="left"/>
-            </w:pPr>
-            <w:r>
-              <w:rPr>
-                <w:highlight w:val="yellow"/>
-              </w:rPr>
-              <w:t>{naam kwaliteitsmanager opdrachtgevende organisatie}</w:t>
-            </w:r>
-          </w:p>
-        </w:tc>
-        <w:tc>
-          <w:tcPr>
-            <w:tcW w:type="auto" w:w="2267"/>
-          </w:tcPr>
-          <w:p>
-            <w:pPr>
-              <w:jc w:val="left"/>
-            </w:pPr>
-            <w:r>
-              <w:rPr>
-                <w:highlight w:val="yellow"/>
-              </w:rPr>
-              <w:t>{datum}</w:t>
-            </w:r>
-          </w:p>
-        </w:tc>
-        <w:tc>
-          <w:tcPr>
-            <w:tcW w:type="auto" w:w="2267"/>
-          </w:tcPr>
-          <w:p>
-            <w:pPr>
-              <w:jc w:val="center"/>
-            </w:pPr>
-            <w:r>
-              <w:rPr>
-                <w:highlight w:val="yellow"/>
-              </w:rPr>
-              <w:t>{versie}</w:t>
-            </w:r>
-          </w:p>
-        </w:tc>
-      </w:tr>
-      <w:tr>
-        <w:tc>
-          <w:tcPr>
-            <w:tcW w:type="auto" w:w="2267"/>
-          </w:tcPr>
-          <w:p>
-            <w:pPr>
-              <w:jc w:val="left"/>
-            </w:pPr>
-            <w:r>
-              <w:t xml:space="preserve">Kwaliteitsmanager </w:t>
-            </w:r>
-            <w:r>
-              <w:rPr>
-                <w:highlight w:val="yellow"/>
-              </w:rPr>
-              <w:t>{beheerorganisatie}</w:t>
-            </w:r>
-          </w:p>
-        </w:tc>
-        <w:tc>
-          <w:tcPr>
-            <w:tcW w:type="auto" w:w="2267"/>
-          </w:tcPr>
-          <w:p>
-            <w:pPr>
-              <w:jc w:val="left"/>
-            </w:pPr>
-            <w:r>
-              <w:rPr>
-                <w:highlight w:val="yellow"/>
-              </w:rPr>
-              <w:t>{naam kwaliteitsmanager beheerorganisatie}</w:t>
-            </w:r>
-          </w:p>
-        </w:tc>
-        <w:tc>
-          <w:tcPr>
-            <w:tcW w:type="auto" w:w="2267"/>
-          </w:tcPr>
-          <w:p>
-            <w:pPr>
-              <w:jc w:val="left"/>
-            </w:pPr>
-            <w:r>
-              <w:rPr>
-                <w:highlight w:val="yellow"/>
-              </w:rPr>
-              <w:t>{datum}</w:t>
-            </w:r>
-          </w:p>
-        </w:tc>
-        <w:tc>
-          <w:tcPr>
-            <w:tcW w:type="auto" w:w="2267"/>
-          </w:tcPr>
-          <w:p>
-            <w:pPr>
-              <w:jc w:val="center"/>
-            </w:pPr>
-            <w:r>
-              <w:rPr>
-                <w:highlight w:val="yellow"/>
-              </w:rPr>
-              <w:t>{versie}</w:t>
-            </w:r>
-          </w:p>
-        </w:tc>
-      </w:tr>
-      <w:tr>
-        <w:tc>
-          <w:tcPr>
-            <w:tcW w:type="auto" w:w="2267"/>
-          </w:tcPr>
-          <w:p>
-            <w:pPr>
-              <w:jc w:val="left"/>
-            </w:pPr>
-            <w:r>
-              <w:t>Kwaliteitsmanager ICTU</w:t>
-            </w:r>
-          </w:p>
-        </w:tc>
-        <w:tc>
-          <w:tcPr>
-            <w:tcW w:type="auto" w:w="2267"/>
-          </w:tcPr>
-          <w:p>
-            <w:pPr>
-              <w:jc w:val="left"/>
-            </w:pPr>
-            <w:r>
-              <w:rPr>
-                <w:highlight w:val="yellow"/>
-              </w:rPr>
-              <w:t>{naam kwaliteitsmanager ICTU}</w:t>
-            </w:r>
-          </w:p>
-        </w:tc>
-        <w:tc>
-          <w:tcPr>
-            <w:tcW w:type="auto" w:w="2267"/>
-          </w:tcPr>
-          <w:p>
-            <w:pPr>
-              <w:jc w:val="left"/>
-            </w:pPr>
-            <w:r>
-              <w:rPr>
-                <w:highlight w:val="yellow"/>
-              </w:rPr>
-              <w:t>{datum}</w:t>
-            </w:r>
-          </w:p>
-        </w:tc>
-        <w:tc>
-          <w:tcPr>
-            <w:tcW w:type="auto" w:w="2267"/>
-          </w:tcPr>
-          <w:p>
-            <w:pPr>
-              <w:jc w:val="center"/>
-            </w:pPr>
-            <w:r>
-              <w:rPr>
-                <w:highlight w:val="yellow"/>
-              </w:rPr>
-              <w:t>{versie}</w:t>
-            </w:r>
-          </w:p>
-        </w:tc>
-      </w:tr>
-    </w:tbl>
-    <w:p>
-      <w:pPr>
-        <w:pStyle w:val="Kop6"/>
-      </w:pPr>
-      <w:r>
-        <w:t>Vereiste goedkeuringen</w:t>
-      </w:r>
-    </w:p>
-    <w:tbl>
-      <w:tblPr>
-        <w:tblStyle w:val="Tabelraster1"/>
-        <w:tblW w:type="pct" w:w="100%"/>
-        <w:tblLook w:firstColumn="1" w:firstRow="1" w:lastColumn="0" w:lastRow="0" w:noHBand="0" w:noVBand="1" w:val="04A0"/>
-      </w:tblPr>
-      <w:tblGrid>
-        <w:gridCol w:w="2267"/>
-        <w:gridCol w:w="2267"/>
-        <w:gridCol w:w="2267"/>
-        <w:gridCol w:w="2267"/>
-      </w:tblGrid>
-      <w:tr>
-        <w:tc>
-          <w:tcPr>
-            <w:tcW w:type="auto" w:w="2267"/>
-          </w:tcPr>
-          <w:p>
-            <w:pPr>
-              <w:jc w:val="left"/>
-            </w:pPr>
-            <w:r>
-              <w:t>Functie/rol</w:t>
-            </w:r>
-          </w:p>
-        </w:tc>
-        <w:tc>
-          <w:tcPr>
-            <w:tcW w:type="auto" w:w="2267"/>
-          </w:tcPr>
-          <w:p>
-            <w:pPr>
-              <w:jc w:val="left"/>
-            </w:pPr>
-            <w:r>
-              <w:t>Naam</w:t>
-            </w:r>
-          </w:p>
-        </w:tc>
-        <w:tc>
-          <w:tcPr>
-            <w:tcW w:type="auto" w:w="2267"/>
-          </w:tcPr>
-          <w:p>
-            <w:pPr>
-              <w:jc w:val="left"/>
-            </w:pPr>
-            <w:r>
-              <w:t>Datum</w:t>
-            </w:r>
-          </w:p>
-        </w:tc>
-        <w:tc>
-          <w:tcPr>
-            <w:tcW w:type="auto" w:w="2267"/>
-          </w:tcPr>
-          <w:p>
-            <w:pPr>
-              <w:jc w:val="center"/>
-            </w:pPr>
-            <w:r>
-              <w:t>Versie</w:t>
-            </w:r>
-          </w:p>
-        </w:tc>
-      </w:tr>
-      <w:tr>
-        <w:tc>
-          <w:tcPr>
-            <w:tcW w:type="auto" w:w="2267"/>
-          </w:tcPr>
-          <w:p>
-            <w:pPr>
-              <w:jc w:val="left"/>
-            </w:pPr>
-            <w:r>
-              <w:t xml:space="preserve">Projectleider </w:t>
-            </w:r>
-            <w:r>
-              <w:rPr>
-                <w:highlight w:val="yellow"/>
-              </w:rPr>
-              <w:t>{opdrachtgevende organisatie}</w:t>
-            </w:r>
-          </w:p>
-        </w:tc>
-        <w:tc>
-          <w:tcPr>
-            <w:tcW w:type="auto" w:w="2267"/>
-          </w:tcPr>
-          <w:p>
-            <w:pPr>
-              <w:jc w:val="left"/>
-            </w:pPr>
-            <w:r>
-              <w:rPr>
-                <w:highlight w:val="yellow"/>
-              </w:rPr>
-              <w:t>{naam projectleider opdrachtgevende organisatie}</w:t>
-            </w:r>
-          </w:p>
-        </w:tc>
-        <w:tc>
-          <w:tcPr>
-            <w:tcW w:type="auto" w:w="2267"/>
-          </w:tcPr>
-          <w:p>
-            <w:pPr>
-              <w:jc w:val="left"/>
-            </w:pPr>
-            <w:r>
-              <w:rPr>
-                <w:highlight w:val="yellow"/>
-              </w:rPr>
-              <w:t>{datum}</w:t>
-            </w:r>
-          </w:p>
-        </w:tc>
-        <w:tc>
-          <w:tcPr>
-            <w:tcW w:type="auto" w:w="2267"/>
-          </w:tcPr>
-          <w:p>
-            <w:pPr>
-              <w:jc w:val="center"/>
-            </w:pPr>
-            <w:r>
-              <w:rPr>
-                <w:highlight w:val="yellow"/>
-              </w:rPr>
-              <w:t>{versie}</w:t>
-            </w:r>
-          </w:p>
-        </w:tc>
-      </w:tr>
-      <w:tr>
-        <w:tc>
-          <w:tcPr>
-            <w:tcW w:type="auto" w:w="2267"/>
-          </w:tcPr>
-          <w:p>
-            <w:pPr>
-              <w:jc w:val="left"/>
-            </w:pPr>
-            <w:r>
-              <w:t xml:space="preserve">Projectleider </w:t>
-            </w:r>
-            <w:r>
-              <w:rPr>
-                <w:highlight w:val="yellow"/>
-              </w:rPr>
-              <w:t>{beheerorganisatie}</w:t>
-            </w:r>
-          </w:p>
-        </w:tc>
-        <w:tc>
-          <w:tcPr>
-            <w:tcW w:type="auto" w:w="2267"/>
-          </w:tcPr>
-          <w:p>
-            <w:pPr>
-              <w:jc w:val="left"/>
-            </w:pPr>
-            <w:r>
-              <w:rPr>
-                <w:highlight w:val="yellow"/>
-              </w:rPr>
-              <w:t>{naam projectleider beheerorganisatie}</w:t>
-            </w:r>
-          </w:p>
-        </w:tc>
-        <w:tc>
-          <w:tcPr>
-            <w:tcW w:type="auto" w:w="2267"/>
-          </w:tcPr>
-          <w:p>
-            <w:pPr>
-              <w:jc w:val="left"/>
-            </w:pPr>
-            <w:r>
-              <w:rPr>
-                <w:highlight w:val="yellow"/>
-              </w:rPr>
-              <w:t>{datum}</w:t>
-            </w:r>
-          </w:p>
-        </w:tc>
-        <w:tc>
-          <w:tcPr>
-            <w:tcW w:type="auto" w:w="2267"/>
-          </w:tcPr>
-          <w:p>
-            <w:pPr>
-              <w:jc w:val="center"/>
-            </w:pPr>
-            <w:r>
-              <w:rPr>
-                <w:highlight w:val="yellow"/>
-              </w:rPr>
-              <w:t>{versie}</w:t>
-            </w:r>
-          </w:p>
-        </w:tc>
-      </w:tr>
-      <w:tr>
-        <w:tc>
-          <w:tcPr>
-            <w:tcW w:type="auto" w:w="2267"/>
-          </w:tcPr>
-          <w:p>
-            <w:pPr>
-              <w:jc w:val="left"/>
-            </w:pPr>
-            <w:r>
-              <w:t>Projectleider ICTU</w:t>
-            </w:r>
-          </w:p>
-        </w:tc>
-        <w:tc>
-          <w:tcPr>
-            <w:tcW w:type="auto" w:w="2267"/>
-          </w:tcPr>
-          <w:p>
-            <w:pPr>
-              <w:jc w:val="left"/>
-            </w:pPr>
-            <w:r>
-              <w:rPr>
-                <w:highlight w:val="yellow"/>
-              </w:rPr>
-              <w:t>{naam projectleider ICTU}</w:t>
-            </w:r>
-          </w:p>
-        </w:tc>
-        <w:tc>
-          <w:tcPr>
-            <w:tcW w:type="auto" w:w="2267"/>
-          </w:tcPr>
-          <w:p>
-            <w:pPr>
-              <w:jc w:val="left"/>
-            </w:pPr>
-            <w:r>
-              <w:rPr>
-                <w:highlight w:val="yellow"/>
-              </w:rPr>
-              <w:t>{datum}</w:t>
-            </w:r>
-          </w:p>
-        </w:tc>
-        <w:tc>
-          <w:tcPr>
-            <w:tcW w:type="auto" w:w="2267"/>
-          </w:tcPr>
-          <w:p>
-            <w:pPr>
-              <w:jc w:val="center"/>
-            </w:pPr>
-            <w:r>
-              <w:rPr>
-                <w:highlight w:val="yellow"/>
-              </w:rPr>
-              <w:t>{versie}</w:t>
-            </w:r>
-          </w:p>
-        </w:tc>
-      </w:tr>
-      <w:tr>
-        <w:tc>
-          <w:tcPr>
-            <w:tcW w:type="auto" w:w="2267"/>
-          </w:tcPr>
-          <w:p>
-            <w:pPr>
-              <w:jc w:val="left"/>
-            </w:pPr>
-            <w:r>
-              <w:t>Product owner</w:t>
-            </w:r>
-          </w:p>
-        </w:tc>
-        <w:tc>
-          <w:tcPr>
-            <w:tcW w:type="auto" w:w="2267"/>
-          </w:tcPr>
-          <w:p>
-            <w:pPr>
-              <w:jc w:val="left"/>
-            </w:pPr>
-            <w:r>
-              <w:rPr>
-                <w:highlight w:val="yellow"/>
-              </w:rPr>
-              <w:t>{naam product owner}</w:t>
-            </w:r>
-          </w:p>
-        </w:tc>
-        <w:tc>
-          <w:tcPr>
-            <w:tcW w:type="auto" w:w="2267"/>
-          </w:tcPr>
-          <w:p>
-            <w:pPr>
-              <w:jc w:val="left"/>
-            </w:pPr>
-            <w:r>
-              <w:rPr>
-                <w:highlight w:val="yellow"/>
-              </w:rPr>
-              <w:t>{datum}</w:t>
-            </w:r>
-          </w:p>
-        </w:tc>
-        <w:tc>
-          <w:tcPr>
-            <w:tcW w:type="auto" w:w="2267"/>
-          </w:tcPr>
-          <w:p>
-            <w:pPr>
-              <w:jc w:val="center"/>
-            </w:pPr>
-            <w:r>
-              <w:rPr>
-                <w:highlight w:val="yellow"/>
-              </w:rPr>
-              <w:t>{versie}</w:t>
-            </w:r>
-          </w:p>
-        </w:tc>
-      </w:tr>
-    </w:tbl>
-    <w:p>
-      <w:pPr>
-        <w:pStyle w:val="Kop6"/>
-      </w:pPr>
-      <w:r>
-        <w:t>Verzendlijst huidige versie</w:t>
+        <w:t>Goedkeuring</w:t>
       </w:r>
     </w:p>
     <w:tbl>
@@ -1112,10 +326,358 @@
               <w:jc w:val="left"/>
             </w:pPr>
             <w:r>
+              <w:t>Versie</w:t>
+            </w:r>
+          </w:p>
+        </w:tc>
+        <w:tc>
+          <w:tcPr>
+            <w:tcW w:type="auto" w:w="3023"/>
+          </w:tcPr>
+          <w:p>
+            <w:pPr>
+              <w:jc w:val="left"/>
+            </w:pPr>
+            <w:r>
+              <w:t>Datum goedkeuring</w:t>
+            </w:r>
+          </w:p>
+        </w:tc>
+        <w:tc>
+          <w:tcPr>
+            <w:tcW w:type="auto" w:w="3023"/>
+          </w:tcPr>
+          <w:p>
+            <w:pPr>
+              <w:jc w:val="left"/>
+            </w:pPr>
+            <w:r>
+              <w:t>Goedgekeurd door</w:t>
+            </w:r>
+          </w:p>
+        </w:tc>
+      </w:tr>
+      <w:tr>
+        <w:tc>
+          <w:tcPr>
+            <w:tcW w:type="auto" w:w="3023"/>
+          </w:tcPr>
+          <w:p>
+            <w:pPr>
+              <w:jc w:val="left"/>
+            </w:pPr>
+            <w:r>
+              <w:rPr>
+                <w:highlight w:val="yellow"/>
+              </w:rPr>
+              <w:t>{versie}</w:t>
+            </w:r>
+          </w:p>
+        </w:tc>
+        <w:tc>
+          <w:tcPr>
+            <w:tcW w:type="auto" w:w="3023"/>
+          </w:tcPr>
+          <w:p>
+            <w:pPr>
+              <w:jc w:val="left"/>
+            </w:pPr>
+            <w:r>
+              <w:rPr>
+                <w:highlight w:val="yellow"/>
+              </w:rPr>
+              <w:t>{datum}</w:t>
+            </w:r>
+          </w:p>
+        </w:tc>
+        <w:tc>
+          <w:tcPr>
+            <w:tcW w:type="auto" w:w="3023"/>
+          </w:tcPr>
+          <w:p>
+            <w:pPr>
+              <w:jc w:val="left"/>
+            </w:pPr>
+            <w:r>
+              <w:rPr>
+                <w:highlight w:val="yellow"/>
+              </w:rPr>
+              <w:t>{naam}</w:t>
+            </w:r>
+          </w:p>
+        </w:tc>
+      </w:tr>
+    </w:tbl>
+    <w:p>
+      <w:pPr>
+        <w:pStyle w:val="Kop6"/>
+      </w:pPr>
+      <w:r>
+        <w:t>Revisiehistorie</w:t>
+      </w:r>
+    </w:p>
+    <w:tbl>
+      <w:tblPr>
+        <w:tblStyle w:val="Tabelraster1"/>
+        <w:tblW w:type="pct" w:w="100%"/>
+        <w:tblLook w:firstColumn="1" w:firstRow="1" w:lastColumn="0" w:lastRow="0" w:noHBand="0" w:noVBand="1" w:val="04A0"/>
+      </w:tblPr>
+      <w:tblGrid>
+        <w:gridCol w:w="1512"/>
+        <w:gridCol w:w="1512"/>
+        <w:gridCol w:w="1512"/>
+        <w:gridCol w:w="1512"/>
+        <w:gridCol w:w="1512"/>
+        <w:gridCol w:w="1512"/>
+      </w:tblGrid>
+      <w:tr>
+        <w:tc>
+          <w:tcPr>
+            <w:tcW w:type="auto" w:w="1512"/>
+          </w:tcPr>
+          <w:p>
+            <w:pPr>
+              <w:jc w:val="left"/>
+            </w:pPr>
+            <w:r>
+              <w:t>Versie</w:t>
+            </w:r>
+          </w:p>
+        </w:tc>
+        <w:tc>
+          <w:tcPr>
+            <w:tcW w:type="auto" w:w="1512"/>
+          </w:tcPr>
+          <w:p>
+            <w:pPr>
+              <w:jc w:val="left"/>
+            </w:pPr>
+            <w:r>
+              <w:t>Datum</w:t>
+            </w:r>
+          </w:p>
+        </w:tc>
+        <w:tc>
+          <w:tcPr>
+            <w:tcW w:type="auto" w:w="1512"/>
+          </w:tcPr>
+          <w:p>
+            <w:pPr>
+              <w:jc w:val="left"/>
+            </w:pPr>
+            <w:r>
+              <w:t>Status</w:t>
+            </w:r>
+          </w:p>
+        </w:tc>
+        <w:tc>
+          <w:tcPr>
+            <w:tcW w:type="auto" w:w="1512"/>
+          </w:tcPr>
+          <w:p>
+            <w:pPr>
+              <w:jc w:val="left"/>
+            </w:pPr>
+            <w:r>
+              <w:t>Auteur</w:t>
+            </w:r>
+          </w:p>
+        </w:tc>
+        <w:tc>
+          <w:tcPr>
+            <w:tcW w:type="auto" w:w="1512"/>
+          </w:tcPr>
+          <w:p>
+            <w:pPr>
+              <w:jc w:val="left"/>
+            </w:pPr>
+            <w:r>
+              <w:t>Reviewers</w:t>
+            </w:r>
+          </w:p>
+        </w:tc>
+        <w:tc>
+          <w:tcPr>
+            <w:tcW w:type="auto" w:w="1512"/>
+          </w:tcPr>
+          <w:p>
+            <w:pPr>
+              <w:jc w:val="left"/>
+            </w:pPr>
+            <w:r>
+              <w:t>Opmerkingen</w:t>
+            </w:r>
+          </w:p>
+        </w:tc>
+      </w:tr>
+      <w:tr>
+        <w:tc>
+          <w:tcPr>
+            <w:tcW w:type="auto" w:w="1512"/>
+          </w:tcPr>
+          <w:p>
+            <w:pPr>
+              <w:jc w:val="left"/>
+            </w:pPr>
+            <w:r>
+              <w:rPr>
+                <w:highlight w:val="yellow"/>
+              </w:rPr>
+              <w:t>{versie}</w:t>
+            </w:r>
+          </w:p>
+        </w:tc>
+        <w:tc>
+          <w:tcPr>
+            <w:tcW w:type="auto" w:w="1512"/>
+          </w:tcPr>
+          <w:p>
+            <w:pPr>
+              <w:jc w:val="left"/>
+            </w:pPr>
+            <w:r>
+              <w:rPr>
+                <w:highlight w:val="yellow"/>
+              </w:rPr>
+              <w:t>{datum}</w:t>
+            </w:r>
+          </w:p>
+        </w:tc>
+        <w:tc>
+          <w:tcPr>
+            <w:tcW w:type="auto" w:w="1512"/>
+          </w:tcPr>
+          <w:p>
+            <w:pPr>
+              <w:jc w:val="left"/>
+            </w:pPr>
+            <w:r>
+              <w:rPr>
+                <w:highlight w:val="yellow"/>
+              </w:rPr>
+              <w:t>{status}</w:t>
+            </w:r>
+          </w:p>
+        </w:tc>
+        <w:tc>
+          <w:tcPr>
+            <w:tcW w:type="auto" w:w="1512"/>
+          </w:tcPr>
+          <w:p>
+            <w:pPr>
+              <w:jc w:val="left"/>
+            </w:pPr>
+            <w:r>
+              <w:rPr>
+                <w:highlight w:val="yellow"/>
+              </w:rPr>
+              <w:t>{naam}</w:t>
+            </w:r>
+          </w:p>
+        </w:tc>
+        <w:tc>
+          <w:tcPr>
+            <w:tcW w:type="auto" w:w="1512"/>
+          </w:tcPr>
+          <w:p>
+            <w:pPr>
+              <w:jc w:val="left"/>
+            </w:pPr>
+            <w:r>
+              <w:rPr>
+                <w:highlight w:val="yellow"/>
+              </w:rPr>
+              <w:t>{namen}</w:t>
+            </w:r>
+          </w:p>
+        </w:tc>
+        <w:tc>
+          <w:tcPr>
+            <w:tcW w:type="auto" w:w="1512"/>
+          </w:tcPr>
+          <w:p>
+            <w:pPr>
+              <w:jc w:val="left"/>
+            </w:pPr>
+            <w:r>
+              <w:rPr>
+                <w:highlight w:val="yellow"/>
+              </w:rPr>
+              <w:t>{opmerkingen}</w:t>
+            </w:r>
+          </w:p>
+        </w:tc>
+      </w:tr>
+    </w:tbl>
+    <w:p>
+      <w:pPr>
+        <w:pStyle w:val="Kop6"/>
+      </w:pPr>
+      <w:r>
+        <w:t>Betrokkenen bij dit document</w:t>
+      </w:r>
+    </w:p>
+    <w:p>
+      <w:r>
+        <w:rPr>
+          <w:highlight w:val="yellow"/>
+        </w:rPr>
+        <w:t>{Neem in onderstaande tabel de auteurs, reviewers en goedkeurders van dit document op}</w:t>
+      </w:r>
+    </w:p>
+    <w:tbl>
+      <w:tblPr>
+        <w:tblStyle w:val="Tabelraster1"/>
+        <w:tblW w:type="pct" w:w="100%"/>
+        <w:tblLook w:firstColumn="1" w:firstRow="1" w:lastColumn="0" w:lastRow="0" w:noHBand="0" w:noVBand="1" w:val="04A0"/>
+      </w:tblPr>
+      <w:tblGrid>
+        <w:gridCol w:w="3023"/>
+        <w:gridCol w:w="3023"/>
+        <w:gridCol w:w="3023"/>
+      </w:tblGrid>
+      <w:tr>
+        <w:tc>
+          <w:tcPr>
+            <w:tcW w:type="auto" w:w="3023"/>
+          </w:tcPr>
+          <w:p>
+            <w:pPr>
+              <w:jc w:val="left"/>
+            </w:pPr>
+            <w:r>
+              <w:t>Organisatie</w:t>
+            </w:r>
+          </w:p>
+        </w:tc>
+        <w:tc>
+          <w:tcPr>
+            <w:tcW w:type="auto" w:w="3023"/>
+          </w:tcPr>
+          <w:p>
+            <w:pPr>
+              <w:jc w:val="left"/>
+            </w:pPr>
+            <w:r>
+              <w:t>Functie/rol</w:t>
+            </w:r>
+          </w:p>
+        </w:tc>
+        <w:tc>
+          <w:tcPr>
+            <w:tcW w:type="auto" w:w="3023"/>
+          </w:tcPr>
+          <w:p>
+            <w:pPr>
+              <w:jc w:val="left"/>
+            </w:pPr>
+            <w:r>
               <w:t>Naam</w:t>
             </w:r>
           </w:p>
         </w:tc>
+      </w:tr>
+      <w:tr>
         <w:tc>
           <w:tcPr>
             <w:tcW w:type="auto" w:w="3023"/>
@@ -1125,7 +687,10 @@
               <w:jc w:val="left"/>
             </w:pPr>
             <w:r>
-              <w:t>Organisatie</w:t>
+              <w:rPr>
+                <w:highlight w:val="yellow"/>
+              </w:rPr>
+              <w:t>{opdrachtgevende organisatie}</w:t>
             </w:r>
           </w:p>
         </w:tc>
@@ -1138,12 +703,10 @@
               <w:jc w:val="left"/>
             </w:pPr>
             <w:r>
-              <w:t>Functie/rol</w:t>
-            </w:r>
-          </w:p>
-        </w:tc>
-      </w:tr>
-      <w:tr>
+              <w:t>Opdrachtgever</w:t>
+            </w:r>
+          </w:p>
+        </w:tc>
         <w:tc>
           <w:tcPr>
             <w:tcW w:type="auto" w:w="3023"/>
@@ -1156,10 +719,12 @@
               <w:rPr>
                 <w:highlight w:val="yellow"/>
               </w:rPr>
-              <w:t>{naam projectleider opdrachtgevende organisatie}</w:t>
-            </w:r>
-          </w:p>
-        </w:tc>
+              <w:t>{naam}</w:t>
+            </w:r>
+          </w:p>
+        </w:tc>
+      </w:tr>
+      <w:tr>
         <w:tc>
           <w:tcPr>
             <w:tcW w:type="auto" w:w="3023"/>
@@ -1189,8 +754,6 @@
             </w:r>
           </w:p>
         </w:tc>
-      </w:tr>
-      <w:tr>
         <w:tc>
           <w:tcPr>
             <w:tcW w:type="auto" w:w="3023"/>
@@ -1203,10 +766,12 @@
               <w:rPr>
                 <w:highlight w:val="yellow"/>
               </w:rPr>
-              <w:t>{naam product owner}</w:t>
-            </w:r>
-          </w:p>
-        </w:tc>
+              <w:t>{naam}</w:t>
+            </w:r>
+          </w:p>
+        </w:tc>
+      </w:tr>
+      <w:tr>
         <w:tc>
           <w:tcPr>
             <w:tcW w:type="auto" w:w="3023"/>
@@ -1236,8 +801,6 @@
             </w:r>
           </w:p>
         </w:tc>
-      </w:tr>
-      <w:tr>
         <w:tc>
           <w:tcPr>
             <w:tcW w:type="auto" w:w="3023"/>
@@ -1250,10 +813,12 @@
               <w:rPr>
                 <w:highlight w:val="yellow"/>
               </w:rPr>
-              <w:t>{naam projectleider beheerorganisatie}</w:t>
-            </w:r>
-          </w:p>
-        </w:tc>
+              <w:t>{naam}</w:t>
+            </w:r>
+          </w:p>
+        </w:tc>
+      </w:tr>
+      <w:tr>
         <w:tc>
           <w:tcPr>
             <w:tcW w:type="auto" w:w="3023"/>
@@ -1266,6 +831,53 @@
               <w:rPr>
                 <w:highlight w:val="yellow"/>
               </w:rPr>
+              <w:t>{opdrachtgevende organisatie}</w:t>
+            </w:r>
+          </w:p>
+        </w:tc>
+        <w:tc>
+          <w:tcPr>
+            <w:tcW w:type="auto" w:w="3023"/>
+          </w:tcPr>
+          <w:p>
+            <w:pPr>
+              <w:jc w:val="left"/>
+            </w:pPr>
+            <w:r>
+              <w:t>Kwaliteitsmanager</w:t>
+            </w:r>
+          </w:p>
+        </w:tc>
+        <w:tc>
+          <w:tcPr>
+            <w:tcW w:type="auto" w:w="3023"/>
+          </w:tcPr>
+          <w:p>
+            <w:pPr>
+              <w:jc w:val="left"/>
+            </w:pPr>
+            <w:r>
+              <w:rPr>
+                <w:highlight w:val="yellow"/>
+              </w:rPr>
+              <w:t>{naam}</w:t>
+            </w:r>
+          </w:p>
+        </w:tc>
+      </w:tr>
+      <w:tr>
+        <w:tc>
+          <w:tcPr>
+            <w:tcW w:type="auto" w:w="3023"/>
+          </w:tcPr>
+          <w:p>
+            <w:pPr>
+              <w:jc w:val="left"/>
+            </w:pPr>
+            <w:r>
+              <w:rPr>
+                <w:highlight w:val="yellow"/>
+              </w:rPr>
               <w:t>{beheerorganisatie}</w:t>
             </w:r>
           </w:p>
@@ -1283,8 +895,6 @@
             </w:r>
           </w:p>
         </w:tc>
-      </w:tr>
-      <w:tr>
         <w:tc>
           <w:tcPr>
             <w:tcW w:type="auto" w:w="3023"/>
@@ -1297,10 +907,12 @@
               <w:rPr>
                 <w:highlight w:val="yellow"/>
               </w:rPr>
-              <w:t>{naam projectleider ICTU}</w:t>
-            </w:r>
-          </w:p>
-        </w:tc>
+              <w:t>{naam}</w:t>
+            </w:r>
+          </w:p>
+        </w:tc>
+      </w:tr>
+      <w:tr>
         <w:tc>
           <w:tcPr>
             <w:tcW w:type="auto" w:w="3023"/>
@@ -1310,6 +922,53 @@
               <w:jc w:val="left"/>
             </w:pPr>
             <w:r>
+              <w:rPr>
+                <w:highlight w:val="yellow"/>
+              </w:rPr>
+              <w:t>{beheerorganisatie}</w:t>
+            </w:r>
+          </w:p>
+        </w:tc>
+        <w:tc>
+          <w:tcPr>
+            <w:tcW w:type="auto" w:w="3023"/>
+          </w:tcPr>
+          <w:p>
+            <w:pPr>
+              <w:jc w:val="left"/>
+            </w:pPr>
+            <w:r>
+              <w:t>Kwaliteitsmanager</w:t>
+            </w:r>
+          </w:p>
+        </w:tc>
+        <w:tc>
+          <w:tcPr>
+            <w:tcW w:type="auto" w:w="3023"/>
+          </w:tcPr>
+          <w:p>
+            <w:pPr>
+              <w:jc w:val="left"/>
+            </w:pPr>
+            <w:r>
+              <w:rPr>
+                <w:highlight w:val="yellow"/>
+              </w:rPr>
+              <w:t>{naam}</w:t>
+            </w:r>
+          </w:p>
+        </w:tc>
+      </w:tr>
+      <w:tr>
+        <w:tc>
+          <w:tcPr>
+            <w:tcW w:type="auto" w:w="3023"/>
+          </w:tcPr>
+          <w:p>
+            <w:pPr>
+              <w:jc w:val="left"/>
+            </w:pPr>
+            <w:r>
               <w:t>ICTU</w:t>
             </w:r>
           </w:p>
@@ -1327,8 +986,6 @@
             </w:r>
           </w:p>
         </w:tc>
-      </w:tr>
-      <w:tr>
         <w:tc>
           <w:tcPr>
             <w:tcW w:type="auto" w:w="3023"/>
@@ -1341,10 +998,12 @@
               <w:rPr>
                 <w:highlight w:val="yellow"/>
               </w:rPr>
-              <w:t>{naam software delivery manager}</w:t>
-            </w:r>
-          </w:p>
-        </w:tc>
+              <w:t>{naam}</w:t>
+            </w:r>
+          </w:p>
+        </w:tc>
+      </w:tr>
+      <w:tr>
         <w:tc>
           <w:tcPr>
             <w:tcW w:type="auto" w:w="3023"/>
@@ -1371,6 +1030,66 @@
             </w:r>
           </w:p>
         </w:tc>
+        <w:tc>
+          <w:tcPr>
+            <w:tcW w:type="auto" w:w="3023"/>
+          </w:tcPr>
+          <w:p>
+            <w:pPr>
+              <w:jc w:val="left"/>
+            </w:pPr>
+            <w:r>
+              <w:rPr>
+                <w:highlight w:val="yellow"/>
+              </w:rPr>
+              <w:t>{naam}</w:t>
+            </w:r>
+          </w:p>
+        </w:tc>
+      </w:tr>
+      <w:tr>
+        <w:tc>
+          <w:tcPr>
+            <w:tcW w:type="auto" w:w="3023"/>
+          </w:tcPr>
+          <w:p>
+            <w:pPr>
+              <w:jc w:val="left"/>
+            </w:pPr>
+            <w:r>
+              <w:t>ICTU</w:t>
+            </w:r>
+          </w:p>
+        </w:tc>
+        <w:tc>
+          <w:tcPr>
+            <w:tcW w:type="auto" w:w="3023"/>
+          </w:tcPr>
+          <w:p>
+            <w:pPr>
+              <w:jc w:val="left"/>
+            </w:pPr>
+            <w:r>
+              <w:t>Kwaliteitsmanager</w:t>
+            </w:r>
+          </w:p>
+        </w:tc>
+        <w:tc>
+          <w:tcPr>
+            <w:tcW w:type="auto" w:w="3023"/>
+          </w:tcPr>
+          <w:p>
+            <w:pPr>
+              <w:jc w:val="left"/>
+            </w:pPr>
+            <w:r>
+              <w:rPr>
+                <w:highlight w:val="yellow"/>
+              </w:rPr>
+              <w:t>{naam}</w:t>
+            </w:r>
+          </w:p>
+        </w:tc>
       </w:tr>
     </w:tbl>
     <w:p>
@@ -1383,7 +1102,7 @@
     </w:p>
     <w:p>
       <w:r>
-        <w:t>Versie wip, 08-11-2024</w:t>
+        <w:t>Versie wip, 27-11-2024</w:t>
       </w:r>
     </w:p>
     <w:p>

</xml_diff>